<commit_message>
correcting HW8 schedule error
</commit_message>
<xml_diff>
--- a/ADA_course_outline Spring 2020.docx
+++ b/ADA_course_outline Spring 2020.docx
@@ -7482,8 +7482,6 @@
               </w:rPr>
               <w:t>Nothing</w:t>
             </w:r>
-            <w:bookmarkStart w:id="2" w:name="_GoBack"/>
-            <w:bookmarkEnd w:id="2"/>
           </w:p>
         </w:tc>
       </w:tr>
@@ -9736,7 +9734,7 @@
                 <w:sz w:val="22"/>
                 <w:szCs w:val="22"/>
               </w:rPr>
-              <w:t>9</w:t>
+              <w:t>8</w:t>
             </w:r>
             <w:r>
               <w:rPr>
@@ -9905,45 +9903,17 @@
                 <w:sz w:val="22"/>
                 <w:szCs w:val="22"/>
               </w:rPr>
-              <w:t>BMC</w:t>
-            </w:r>
-            <w:r>
-              <w:rPr>
+              <w:t>BMC paper:</w:t>
+            </w:r>
+            <w:r>
+              <w:rPr>
+                <w:rStyle w:val="apple-converted-space"/>
                 <w:rFonts w:ascii="Arial" w:hAnsi="Arial" w:cs="Arial"/>
                 <w:color w:val="000000"/>
                 <w:sz w:val="22"/>
                 <w:szCs w:val="22"/>
               </w:rPr>
-              <w:t xml:space="preserve"> </w:t>
-            </w:r>
-            <w:r>
-              <w:rPr>
-                <w:rFonts w:ascii="Arial" w:hAnsi="Arial" w:cs="Arial"/>
-                <w:color w:val="000000"/>
-                <w:sz w:val="22"/>
-                <w:szCs w:val="22"/>
-              </w:rPr>
-              <w:t>paper:</w:t>
-            </w:r>
-            <w:r>
-              <w:rPr>
-                <w:rStyle w:val="apple-converted-space"/>
-                <w:rFonts w:ascii="Arial" w:hAnsi="Arial" w:cs="Arial"/>
-                <w:color w:val="000000"/>
-                <w:sz w:val="22"/>
-                <w:szCs w:val="22"/>
-              </w:rPr>
-              <w:t> </w:t>
-            </w:r>
-            <w:r>
-              <w:rPr>
-                <w:rStyle w:val="apple-converted-space"/>
-                <w:rFonts w:ascii="Arial" w:hAnsi="Arial" w:cs="Arial"/>
-                <w:color w:val="000000"/>
-                <w:sz w:val="22"/>
-                <w:szCs w:val="22"/>
-              </w:rPr>
-              <w:t xml:space="preserve"> </w:t>
+              <w:t xml:space="preserve">  </w:t>
             </w:r>
             <w:hyperlink r:id="rId45" w:history="1">
               <w:r>
@@ -10132,7 +10102,17 @@
                 <w:sz w:val="22"/>
                 <w:szCs w:val="22"/>
               </w:rPr>
-              <w:t xml:space="preserve">9 </w:t>
+              <w:t>8</w:t>
+            </w:r>
+            <w:bookmarkStart w:id="2" w:name="_GoBack"/>
+            <w:bookmarkEnd w:id="2"/>
+            <w:r>
+              <w:rPr>
+                <w:rFonts w:ascii="Arial" w:hAnsi="Arial" w:cs="Arial"/>
+                <w:sz w:val="22"/>
+                <w:szCs w:val="22"/>
+              </w:rPr>
+              <w:t xml:space="preserve"> </w:t>
             </w:r>
             <w:r>
               <w:rPr>
@@ -21156,7 +21136,7 @@
 </file>
 
 <file path=customXml/itemProps1.xml><?xml version="1.0" encoding="utf-8"?>
-<ds:datastoreItem xmlns:ds="http://schemas.openxmlformats.org/officeDocument/2006/customXml" ds:itemID="{CAF15B6B-F559-EE41-B10E-0B405E1E0998}">
+<ds:datastoreItem xmlns:ds="http://schemas.openxmlformats.org/officeDocument/2006/customXml" ds:itemID="{A688155A-A0C1-AF49-B399-76A71EB4771F}">
   <ds:schemaRefs>
     <ds:schemaRef ds:uri="http://schemas.openxmlformats.org/officeDocument/2006/bibliography"/>
   </ds:schemaRefs>

</xml_diff>